<commit_message>
fix: kirish matnini qator bo'yicha to'liq tekislash (justified)
</commit_message>
<xml_diff>
--- a/templates/malumotnoma — O'qiyapti degan.docx
+++ b/templates/malumotnoma — O'qiyapti degan.docx
@@ -497,52 +497,156 @@
         <w:rPr>
           <w:sz w:val="28"/>
           <w:szCs w:val="28"/>
+        </w:rPr>
+      </w:pPr>
+      <w:r>
+        <w:rPr>
+          <w:sz w:val="28"/>
+          <w:szCs w:val="28"/>
+        </w:rPr>
+        <w:t xml:space="preserve">Berildi ushbu ma’lumotnoma shu haqidaki, </w:t>
+      </w:r>
+      <w:r>
+        <w:rPr>
+          <w:b/>
+          <w:bCs/>
+          <w:sz w:val="28"/>
+          <w:szCs w:val="28"/>
+        </w:rPr>
+        <w:t>{{</w:t>
+      </w:r>
+      <w:r>
+        <w:rPr>
+          <w:b/>
+          <w:bCs/>
+          <w:sz w:val="28"/>
+          <w:szCs w:val="28"/>
           <w:lang w:val="en-US"/>
         </w:rPr>
-      </w:pPr>
-      <w:r>
-        <w:rPr>
-          <w:sz w:val="28"/>
-          <w:szCs w:val="28"/>
-        </w:rPr>
-        <w:t xml:space="preserve">Ushbu ma’lumotnoma shuni tasdiqlaydiki, </w:t>
-      </w:r>
-      <w:r>
-        <w:rPr>
+        <w:t>FIO</w:t>
+      </w:r>
+      <w:r>
+        <w:rPr>
+          <w:b/>
+          <w:bCs/>
+          <w:sz w:val="28"/>
+          <w:szCs w:val="28"/>
+        </w:rPr>
+        <w:t>}}</w:t>
+      </w:r>
+      <w:r>
+        <w:rPr>
+          <w:sz w:val="28"/>
+          <w:szCs w:val="28"/>
+        </w:rPr>
+        <w:t xml:space="preserve"> haqiqatdan ham, “Qarshi tibbiyot texnikumi”ning </w:t>
+      </w:r>
+      <w:r>
+        <w:rPr>
+          <w:b/>
+          <w:bCs/>
+          <w:sz w:val="28"/>
+          <w:szCs w:val="28"/>
+        </w:rPr>
+        <w:t>“</w:t>
+      </w:r>
+      <w:r>
+        <w:rPr>
+          <w:b/>
+          <w:bCs/>
+          <w:sz w:val="28"/>
+          <w:szCs w:val="28"/>
+        </w:rPr>
+        <w:t>{{</w:t>
+      </w:r>
+      <w:r>
+        <w:rPr>
+          <w:b/>
+          <w:bCs/>
           <w:sz w:val="28"/>
           <w:szCs w:val="28"/>
           <w:lang w:val="en-US"/>
         </w:rPr>
-        <w:t>haqiqatdan</w:t>
-      </w:r>
-      <w:r>
-        <w:rPr>
-          <w:sz w:val="28"/>
-          <w:szCs w:val="28"/>
-        </w:rPr>
-        <w:t xml:space="preserve"> </w:t>
-      </w:r>
-      <w:r>
-        <w:rPr>
+        <w:t>yonalish</w:t>
+      </w:r>
+      <w:r>
+        <w:rPr>
+          <w:b/>
+          <w:bCs/>
+          <w:sz w:val="28"/>
+          <w:szCs w:val="28"/>
+        </w:rPr>
+        <w:t>}}</w:t>
+      </w:r>
+      <w:r>
+        <w:rPr>
+          <w:b/>
+          <w:bCs/>
+          <w:sz w:val="28"/>
+          <w:szCs w:val="28"/>
+        </w:rPr>
+        <w:t>”</w:t>
+      </w:r>
+      <w:r>
+        <w:rPr>
+          <w:sz w:val="28"/>
+          <w:szCs w:val="28"/>
+        </w:rPr>
+        <w:t xml:space="preserve"> yo‘nalishida </w:t>
+      </w:r>
+      <w:r>
+        <w:rPr>
+          <w:b/>
+          <w:bCs/>
+          <w:sz w:val="28"/>
+          <w:szCs w:val="28"/>
+        </w:rPr>
+        <w:t>{{</w:t>
+      </w:r>
+      <w:r>
+        <w:rPr>
+          <w:b/>
+          <w:bCs/>
           <w:sz w:val="28"/>
           <w:szCs w:val="28"/>
           <w:lang w:val="en-US"/>
         </w:rPr>
-        <w:t>ham</w:t>
-      </w:r>
-      <w:r>
-        <w:rPr>
-          <w:sz w:val="28"/>
-          <w:szCs w:val="28"/>
-        </w:rPr>
-        <w:t xml:space="preserve"> </w:t>
-      </w:r>
-      <w:r>
-        <w:rPr>
-          <w:sz w:val="28"/>
-          <w:szCs w:val="28"/>
-        </w:rPr>
-        <w:br/>
+        <w:t>oquv</w:t>
+      </w:r>
+      <w:r>
+        <w:rPr>
+          <w:b/>
+          <w:bCs/>
+          <w:sz w:val="28"/>
+          <w:szCs w:val="28"/>
+        </w:rPr>
+        <w:t>_</w:t>
+      </w:r>
+      <w:r>
+        <w:rPr>
+          <w:b/>
+          <w:bCs/>
+          <w:sz w:val="28"/>
+          <w:szCs w:val="28"/>
+          <w:lang w:val="en-US"/>
+        </w:rPr>
+        <w:t>yili</w:t>
+      </w:r>
+      <w:r>
+        <w:rPr>
+          <w:b/>
+          <w:bCs/>
+          <w:sz w:val="28"/>
+          <w:szCs w:val="28"/>
+        </w:rPr>
+        <w:t>}}</w:t>
+      </w:r>
+      <w:r>
+        <w:rPr>
+          <w:sz w:val="28"/>
+          <w:szCs w:val="28"/>
+        </w:rPr>
+        <w:t xml:space="preserve"> o‘quv yilida to‘lov kontrakt asosida talabalikka tavsiya etilgan va hozirgi kunda </w:t>
       </w:r>
       <w:r>
         <w:rPr>
@@ -559,9 +663,9 @@
           <w:bCs/>
           <w:sz w:val="28"/>
           <w:szCs w:val="28"/>
-          <w:lang w:val="en-BZ"/>
-        </w:rPr>
-        <w:t>FIO</w:t>
+          <w:lang w:val="en-US"/>
+        </w:rPr>
+        <w:t>guruhi</w:t>
       </w:r>
       <w:r>
         <w:rPr>
@@ -574,24 +678,19 @@
       </w:r>
       <w:r>
         <w:rPr>
-          <w:sz w:val="28"/>
-          <w:szCs w:val="28"/>
-        </w:rPr>
-        <w:t xml:space="preserve"> </w:t>
-      </w:r>
-      <w:r>
-        <w:rPr>
-          <w:sz w:val="28"/>
-          <w:szCs w:val="28"/>
-        </w:rPr>
-        <w:t>{{OQUV_YILI}}</w:t>
-      </w:r>
-      <w:r>
-        <w:rPr>
-          <w:sz w:val="28"/>
-          <w:szCs w:val="28"/>
-        </w:rPr>
-        <w:t xml:space="preserve">-o‘quv yilida </w:t>
+          <w:b/>
+          <w:bCs/>
+          <w:sz w:val="28"/>
+          <w:szCs w:val="28"/>
+        </w:rPr>
+        <w:t>-</w:t>
+      </w:r>
+      <w:r>
+        <w:rPr>
+          <w:sz w:val="28"/>
+          <w:szCs w:val="28"/>
+        </w:rPr>
+        <w:t xml:space="preserve">guruhda </w:t>
       </w:r>
       <w:r>
         <w:rPr>
@@ -608,9 +707,9 @@
           <w:bCs/>
           <w:sz w:val="28"/>
           <w:szCs w:val="28"/>
-          <w:lang w:val="en-BZ"/>
-        </w:rPr>
-        <w:t>YONALISH</w:t>
+          <w:lang w:val="en-US"/>
+        </w:rPr>
+        <w:t>kursi</w:t>
       </w:r>
       <w:r>
         <w:rPr>
@@ -626,185 +725,7 @@
           <w:sz w:val="28"/>
           <w:szCs w:val="28"/>
         </w:rPr>
-        <w:t xml:space="preserve"> yo‘nalishiga </w:t>
-      </w:r>
-      <w:r>
-        <w:rPr>
-          <w:rStyle w:val="a4"/>
-          <w:b w:val="0"/>
-          <w:bCs w:val="0"/>
-          <w:sz w:val="28"/>
-          <w:szCs w:val="28"/>
-        </w:rPr>
-        <w:t>shartnoma asosida o‘qishga qabul qilin</w:t>
-      </w:r>
-      <w:r>
-        <w:rPr>
-          <w:rStyle w:val="a4"/>
-          <w:b w:val="0"/>
-          <w:bCs w:val="0"/>
-          <w:sz w:val="28"/>
-          <w:szCs w:val="28"/>
-          <w:lang w:val="en-US"/>
-        </w:rPr>
-        <w:t>di</w:t>
-      </w:r>
-      <w:r>
-        <w:rPr>
-          <w:rStyle w:val="a4"/>
-          <w:b w:val="0"/>
-          <w:bCs w:val="0"/>
-          <w:sz w:val="28"/>
-          <w:szCs w:val="28"/>
-        </w:rPr>
-        <w:t>.</w:t>
-      </w:r>
-      <w:r>
-        <w:rPr>
-          <w:sz w:val="28"/>
-          <w:szCs w:val="28"/>
-        </w:rPr>
-        <w:t xml:space="preserve"> </w:t>
-      </w:r>
-      <w:r>
-        <w:rPr>
-          <w:sz w:val="28"/>
-          <w:szCs w:val="28"/>
-          <w:lang w:val="en-US"/>
-        </w:rPr>
-        <w:t>Talaba</w:t>
-      </w:r>
-      <w:r>
-        <w:rPr>
-          <w:sz w:val="28"/>
-          <w:szCs w:val="28"/>
-          <w:lang w:val="en-US"/>
-        </w:rPr>
-        <w:t xml:space="preserve"> </w:t>
-      </w:r>
-      <w:proofErr w:type="gramStart"/>
-      <w:r>
-        <w:rPr>
-          <w:sz w:val="28"/>
-          <w:szCs w:val="28"/>
-          <w:lang w:val="en-US"/>
-        </w:rPr>
-        <w:t>o</w:t>
-      </w:r>
-      <w:r>
-        <w:rPr>
-          <w:sz w:val="28"/>
-          <w:szCs w:val="28"/>
-          <w:lang w:val="en-US"/>
-        </w:rPr>
-        <w:t>‘</w:t>
-      </w:r>
-      <w:proofErr w:type="gramEnd"/>
-      <w:r>
-        <w:rPr>
-          <w:sz w:val="28"/>
-          <w:szCs w:val="28"/>
-          <w:lang w:val="en-US"/>
-        </w:rPr>
-        <w:t>qishni</w:t>
-      </w:r>
-      <w:r>
-        <w:rPr>
-          <w:sz w:val="28"/>
-          <w:szCs w:val="28"/>
-          <w:lang w:val="en-US"/>
-        </w:rPr>
-        <w:t xml:space="preserve"> </w:t>
-      </w:r>
-      <w:r>
-        <w:rPr>
-          <w:rStyle w:val="a4"/>
-          <w:b w:val="0"/>
-          <w:bCs w:val="0"/>
-          <w:sz w:val="28"/>
-          <w:szCs w:val="28"/>
-          <w:lang w:val="en-US"/>
-        </w:rPr>
-        <w:t>2026-</w:t>
-      </w:r>
-      <w:r>
-        <w:rPr>
-          <w:rStyle w:val="a4"/>
-          <w:b w:val="0"/>
-          <w:bCs w:val="0"/>
-          <w:sz w:val="28"/>
-          <w:szCs w:val="28"/>
-          <w:lang w:val="en-US"/>
-        </w:rPr>
-        <w:t>yil</w:t>
-      </w:r>
-      <w:r>
-        <w:rPr>
-          <w:rStyle w:val="a4"/>
-          <w:b w:val="0"/>
-          <w:bCs w:val="0"/>
-          <w:sz w:val="28"/>
-          <w:szCs w:val="28"/>
-          <w:lang w:val="en-US"/>
-        </w:rPr>
-        <w:t xml:space="preserve"> </w:t>
-      </w:r>
-      <w:r>
-        <w:rPr>
-          <w:rStyle w:val="a4"/>
-          <w:b w:val="0"/>
-          <w:bCs w:val="0"/>
-          <w:sz w:val="28"/>
-          <w:szCs w:val="28"/>
-          <w:lang w:val="en-US"/>
-        </w:rPr>
-        <w:t>sentyabr</w:t>
-      </w:r>
-      <w:r>
-        <w:rPr>
-          <w:rStyle w:val="a4"/>
-          <w:b w:val="0"/>
-          <w:bCs w:val="0"/>
-          <w:sz w:val="28"/>
-          <w:szCs w:val="28"/>
-          <w:lang w:val="en-US"/>
-        </w:rPr>
-        <w:t xml:space="preserve"> </w:t>
-      </w:r>
-      <w:r>
-        <w:rPr>
-          <w:rStyle w:val="a4"/>
-          <w:b w:val="0"/>
-          <w:bCs w:val="0"/>
-          <w:sz w:val="28"/>
-          <w:szCs w:val="28"/>
-          <w:lang w:val="en-US"/>
-        </w:rPr>
-        <w:t>oyidan</w:t>
-      </w:r>
-      <w:r>
-        <w:rPr>
-          <w:sz w:val="28"/>
-          <w:szCs w:val="28"/>
-          <w:lang w:val="en-US"/>
-        </w:rPr>
-        <w:t xml:space="preserve"> </w:t>
-      </w:r>
-      <w:r>
-        <w:rPr>
-          <w:sz w:val="28"/>
-          <w:szCs w:val="28"/>
-          <w:lang w:val="en-US"/>
-        </w:rPr>
-        <w:t>boshlaydi</w:t>
-      </w:r>
-      <w:r>
-        <w:rPr>
-          <w:sz w:val="28"/>
-          <w:szCs w:val="28"/>
-          <w:lang w:val="en-US"/>
-        </w:rPr>
-        <w:t>.</w:t>
+        <w:t>-kursda o‘qimoqda.</w:t>
       </w:r>
     </w:p>
     <w:p>
@@ -827,29 +748,7 @@
           <w:szCs w:val="28"/>
           <w:lang w:val="en-US"/>
         </w:rPr>
-        <w:t xml:space="preserve">Ma’lumotnoma </w:t>
-      </w:r>
-      <w:proofErr w:type="gramStart"/>
-      <w:r>
-        <w:rPr>
-          <w:rFonts w:cs="Times New Roman"/>
-          <w:i/>
-          <w:iCs/>
-          <w:szCs w:val="28"/>
-          <w:lang w:val="en-US"/>
-        </w:rPr>
-        <w:t>so‘</w:t>
-      </w:r>
-      <w:proofErr w:type="gramEnd"/>
-      <w:r>
-        <w:rPr>
-          <w:rFonts w:cs="Times New Roman"/>
-          <w:i/>
-          <w:iCs/>
-          <w:szCs w:val="28"/>
-          <w:lang w:val="en-US"/>
-        </w:rPr>
-        <w:t>ralgan joyga taqdim etish uchun berildi</w:t>
+        <w:t>Ma’lumotnoma so‘ralgan joyga taqdim etish uchun berildi</w:t>
       </w:r>
     </w:p>
     <w:p>
@@ -891,7 +790,7 @@
           <w:lang w:val="en-US"/>
         </w:rPr>
         <w:drawing>
-          <wp:anchor distT="0" distB="0" distL="114300" distR="114300" simplePos="0" relativeHeight="251658240" behindDoc="0" locked="0" layoutInCell="1" allowOverlap="1" wp14:anchorId="35982B2F" wp14:editId="7F4ECA9A">
+          <wp:anchor distT="0" distB="0" distL="114300" distR="114300" simplePos="0" relativeHeight="251658240" behindDoc="0" locked="0" layoutInCell="1" allowOverlap="1" wp14:anchorId="35982B2F" wp14:editId="2A3B8C6E">
             <wp:simplePos x="0" y="0"/>
             <wp:positionH relativeFrom="column">
               <wp:posOffset>-1346835</wp:posOffset>

</xml_diff>